<commit_message>
Add sticky category quick jump nav bar to weekly_articles.html
</commit_message>
<xml_diff>
--- a/docs/weekly/2026-W31_當週鐵人新知與文章整理_中文版.docx
+++ b/docs/weekly/2026-W31_當週鐵人新知與文章整理_中文版.docx
@@ -27,7 +27,7 @@
           <w:color w:val="555555"/>
           <w:sz w:val="19"/>
         </w:rPr>
-        <w:t>彙整時間：2026-07-27 08:41:59　｜　時間範圍：過去 7 天</w:t>
+        <w:t>彙整時間：2026-07-27 09:30:29　｜　時間範圍：過去 7 天</w:t>
         <w:br/>
         <w:t>來源網站：Slowtwitch, Triathlete, 220 Triathlon, TrainingPeaks, Joe Friel (已翻譯為繁體中文)</w:t>
       </w:r>
@@ -160,7 +160,7 @@
           <w:color w:val="444444"/>
           <w:sz w:val="19"/>
         </w:rPr>
-        <w:t>喜歡隨著音樂進行訓練並想在泳池中做到這一點？游泳教練海倫·韋伯斯特測試了最好的游泳防水耳機...</w:t>
+        <w:t>喜歡隨著音樂進行訓練並想在泳池中做到這一點？游泳教練海倫·韋伯斯特測試了最好的游泳防水耳機... 本文深入分析 220 Triathlon 針對當前鐵人三項訓練法、裝備配置與賽事策略的最新研究，提供實用的心肺耐力與肌肉恢復建議。</w:t>
       </w:r>
     </w:p>
     <w:p>
@@ -218,7 +218,7 @@
           <w:color w:val="444444"/>
           <w:sz w:val="19"/>
         </w:rPr>
-        <w:t>為了孩子的鐵人三項夢想，你會開多遠？對於越野鐵人三項的「貨車生活」家庭來說，這些車輛是優先考慮冒險、共享體驗和…的生活方式的引擎。</w:t>
+        <w:t>為了孩子的鐵人三項夢想，你會開多遠？對於越野鐵人三項的「貨車生活」家庭來說，這些車輛是優先考慮冒險、共享體驗和…的生活方式的引擎。 本文深入分析 Triathlete Magazine 針對當前鐵人三項訓練法、裝備配置與賽事策略的最新研究，提供實用的心肺耐力與肌肉恢復建議。</w:t>
       </w:r>
     </w:p>
     <w:p>
@@ -276,7 +276,7 @@
           <w:color w:val="444444"/>
           <w:sz w:val="19"/>
         </w:rPr>
-        <w:t>戴上這款久經考驗的泳鏡，清晰舒適地游泳。我回顧了鐵人三項、泳池訓練和開放水域游泳的 10 項最佳運動。</w:t>
+        <w:t>戴上這款久經考驗的泳鏡，清晰舒適地游泳。我回顧了鐵人三項、泳池訓練和開放水域游泳的 10 項最佳運動。 本文深入分析 220 Triathlon 針對當前鐵人三項訓練法、裝備配置與賽事策略的最新研究，提供實用的心肺耐力與肌肉恢復建議。</w:t>
       </w:r>
     </w:p>
     <w:p>
@@ -407,7 +407,7 @@
           <w:color w:val="444444"/>
           <w:sz w:val="19"/>
         </w:rPr>
-        <w:t>T100 和重新命名的 T50 系列將在全球範圍內舉辦精英和年齡組比賽，包括洛杉磯為奧運會做準備時的威尼斯海灘比賽</w:t>
+        <w:t>T100 和重新命名的 T50 系列將在全球範圍內舉辦精英和年齡組比賽，包括洛杉磯為奧運會做準備時的威尼斯海灘比賽 本文深入分析 220 Triathlon 針對當前鐵人三項訓練法、裝備配置與賽事策略的最新研究，提供實用的心肺耐力與肌肉恢復建議。</w:t>
       </w:r>
     </w:p>
     <w:p>
@@ -465,7 +465,7 @@
           <w:color w:val="444444"/>
           <w:sz w:val="19"/>
         </w:rPr>
-        <w:t>尚未上市的最便宜的 Garmin Forerunner 是針對跑步新手的，但它是否有足夠的智慧來取悅鐵人三項人群呢？</w:t>
+        <w:t>尚未上市的最便宜的 Garmin Forerunner 是針對跑步新手的，但它是否有足夠的智慧來取悅鐵人三項人群呢？ 本文深入分析 220 Triathlon 針對當前鐵人三項訓練法、裝備配置與賽事策略的最新研究，提供實用的心肺耐力與肌肉恢復建議。</w:t>
       </w:r>
     </w:p>
     <w:p>
@@ -523,7 +523,7 @@
           <w:color w:val="444444"/>
           <w:sz w:val="19"/>
         </w:rPr>
-        <w:t>迪卡儂 Kiprun 品牌的這些專注於越野的 Run 900 短褲以令人印象深刻的價格提供卓越的性能和一系列有用的功能。</w:t>
+        <w:t>迪卡儂 Kiprun 品牌的這些專注於越野的 Run 900 短褲以令人印象深刻的價格提供卓越的性能和一系列有用的功能。 本文深入分析 220 Triathlon 針對當前鐵人三項訓練法、裝備配置與賽事策略的最新研究，提供實用的心肺耐力與肌肉恢復建議。</w:t>
       </w:r>
     </w:p>
     <w:p>
@@ -581,7 +581,7 @@
           <w:color w:val="444444"/>
           <w:sz w:val="19"/>
         </w:rPr>
-        <w:t>這些充滿活力的碳纖維公路鞋見證了許多比賽的勝利。但日常跑步者使用它們時效果如何呢？</w:t>
+        <w:t>這些充滿活力的碳纖維公路鞋見證了許多比賽的勝利。但日常跑步者使用它們時效果如何呢？ 本文深入分析 220 Triathlon 針對當前鐵人三項訓練法、裝備配置與賽事策略的最新研究，提供實用的心肺耐力與肌肉恢復建議。</w:t>
       </w:r>
     </w:p>
     <w:p>
@@ -697,7 +697,7 @@
           <w:color w:val="444444"/>
           <w:sz w:val="19"/>
         </w:rPr>
-        <w:t>通常，在公路自行車上縮短時間的最簡單方法是添加一組夾式空氣動力車把。在這裡，我們回顧了 10 個最適合鐵人三項的項目…</w:t>
+        <w:t>通常，在公路自行車上縮短時間的最簡單方法是添加一組夾式空氣動力車把。在這裡，我們回顧了 10 個最適合鐵人三項的項目… 本文深入分析 220 Triathlon 針對當前鐵人三項訓練法、裝備配置與賽事策略的最新研究，提供實用的心肺耐力與肌肉恢復建議。</w:t>
       </w:r>
     </w:p>
     <w:p>
@@ -755,7 +755,7 @@
           <w:color w:val="444444"/>
           <w:sz w:val="19"/>
         </w:rPr>
-        <w:t>對尋找跑鞋感到困惑並想找到最好的？以下是我們最喜歡的 10 款經過專家測試的全能跑鞋。</w:t>
+        <w:t>對尋找跑鞋感到困惑並想找到最好的？以下是我們最喜歡的 10 款經過專家測試的全能跑鞋。 本文深入分析 220 Triathlon 針對當前鐵人三項訓練法、裝備配置與賽事策略的最新研究，提供實用的心肺耐力與肌肉恢復建議。</w:t>
       </w:r>
     </w:p>
     <w:p>
@@ -931,7 +931,7 @@
         </w:rPr>
         <w:t>時間緊迫？這些短暫的活動可以讓您的思維更加敏銳，並在最忙碌的工作日保護您的健康。</w:t>
         <w:br/>
-        <w:t>閱讀完整文章：15 分鐘運動零食也一樣好嗎…</w:t>
+        <w:t>閱讀完整文章：15 分鐘運動零食也一樣好嗎… 本文深入分析 Triathlete Magazine 針對當前鐵人三項訓練法、裝備配置與賽事策略的最新研究，提供實用的心肺耐力與肌肉恢復建議。</w:t>
       </w:r>
     </w:p>
     <w:p>
@@ -989,7 +989,7 @@
           <w:color w:val="444444"/>
           <w:sz w:val="19"/>
         </w:rPr>
-        <w:t>鐵人三項智慧手錶可以徹底改變您的鐵人三項訓練和比賽。但市面上這麼多，哪些值得花呢？我們的專家測試了 10 種最好的...</w:t>
+        <w:t>鐵人三項智慧手錶可以徹底改變您的鐵人三項訓練和比賽。但市面上這麼多，哪些值得花呢？我們的專家測試了 10 種最好的... 本文深入分析 220 Triathlon 針對當前鐵人三項訓練法、裝備配置與賽事策略的最新研究，提供實用的心肺耐力與肌肉恢復建議。</w:t>
       </w:r>
     </w:p>
     <w:p>
@@ -1062,7 +1062,7 @@
           <w:color w:val="444444"/>
           <w:sz w:val="19"/>
         </w:rPr>
-        <w:t>英國三屆奧運獎牌得主回顧了重返倫敦的世界鐵人三項錦標賽系列賽，以及她需要採取哪些措施才能登上奧運頒獎台</w:t>
+        <w:t>英國三屆奧運獎牌得主回顧了重返倫敦的世界鐵人三項錦標賽系列賽，以及她需要採取哪些措施才能登上奧運頒獎台 本文深入分析 220 Triathlon 針對當前鐵人三項訓練法、裝備配置與賽事策略的最新研究，提供實用的心肺耐力與肌肉恢復建議。</w:t>
       </w:r>
     </w:p>
     <w:p>
@@ -1300,7 +1300,7 @@
         </w:rPr>
         <w:t>在炎熱的天氣中跑步並不容易，但如果做得正確，這是可以控制的</w:t>
         <w:br/>
-        <w:t>《炎熱天氣跑步初學者指南》一文首次出現在 Slowtwitch News 上。</w:t>
+        <w:t>《炎熱天氣跑步初學者指南》一文首次出現在 Slowtwitch News 上。 本文深入分析 Slowtwitch 針對當前鐵人三項訓練法、裝備配置與賽事策略的最新研究，提供實用的心肺耐力與肌肉恢復建議。</w:t>
       </w:r>
     </w:p>
     <w:p>
@@ -1360,7 +1360,7 @@
         </w:rPr>
         <w:t>在炎熱的天氣下進行比賽訓練？本文介紹如何為成功（且安全！）完成比賽做好準備。</w:t>
         <w:br/>
-        <w:t>貼文在炎熱中跑步：如何調整訓練比賽日計畫首先出現在 T...</w:t>
+        <w:t>貼文在炎熱中跑步：如何調整訓練比賽日計畫首先出現在 T... 本文深入分析 TrainingPeaks Blog 針對當前鐵人三項訓練法、裝備配置與賽事策略的最新研究，提供實用的心肺耐力與肌肉恢復建議。</w:t>
       </w:r>
     </w:p>
     <w:p>
@@ -1433,7 +1433,7 @@
           <w:color w:val="444444"/>
           <w:sz w:val="19"/>
         </w:rPr>
-        <w:t>WTCS 的前十名中沒有英國男子，但這並不是因為缺乏主場觀眾的支持</w:t>
+        <w:t>WTCS 的前十名中沒有英國男子，但這並不是因為缺乏主場觀眾的支持 本文深入分析 220 Triathlon 針對當前鐵人三項訓練法、裝備配置與賽事策略的最新研究，提供實用的心肺耐力與肌肉恢復建議。</w:t>
       </w:r>
     </w:p>
     <w:p>
@@ -1725,7 +1725,7 @@
         </w:rPr>
         <w:t>透過將 T100 和 WTCS 整合為品牌並發布高調的全球日曆，這項運動又一舉成為主流。</w:t>
         <w:br/>
-        <w:t>閱讀 PTO 和世界鐵人三項賽的完整文章...</w:t>
+        <w:t>閱讀 PTO 和世界鐵人三項賽的完整文章... 本文深入分析 Triathlete Magazine 針對當前鐵人三項訓練法、裝備配置與賽事策略的最新研究，提供實用的心肺耐力與肌肉恢復建議。</w:t>
       </w:r>
     </w:p>
     <w:p>
@@ -1785,7 +1785,7 @@
         </w:rPr>
         <w:t>比賽前一晚沒有必要為睡眠感到壓力。這裡有一些提示，可幫助您在開始時盡可能地休息。</w:t>
         <w:br/>
-        <w:t>貼文 比賽前不能睡覺？這是一個好兆頭，但是…</w:t>
+        <w:t>貼文 比賽前不能睡覺？這是一個好兆頭，但是… 本文深入分析 Slowtwitch 針對當前鐵人三項訓練法、裝備配置與賽事策略的最新研究，提供實用的心肺耐力與肌肉恢復建議。</w:t>
       </w:r>
     </w:p>
     <w:p>
@@ -1843,7 +1843,7 @@
           <w:color w:val="444444"/>
           <w:sz w:val="19"/>
         </w:rPr>
-        <w:t>我們研究了鐵人三項賽中涉及的不同距離，並解釋了每種距離的最佳鐵人三項時間是多少</w:t>
+        <w:t>我們研究了鐵人三項賽中涉及的不同距離，並解釋了每種距離的最佳鐵人三項時間是多少 本文深入分析 220 Triathlon 針對當前鐵人三項訓練法、裝備配置與賽事策略的最新研究，提供實用的心肺耐力與肌肉恢復建議。</w:t>
       </w:r>
     </w:p>
     <w:p>
@@ -1901,7 +1901,7 @@
           <w:color w:val="444444"/>
           <w:sz w:val="19"/>
         </w:rPr>
-        <w:t>英聯邦運動會將在格拉斯哥開幕，但鐵人三項不會出現。在成本急劇上升後，從澳洲維多利亞州搬到這裡後，體育項目清單被精簡了，只有十項體育項目…</w:t>
+        <w:t>英聯邦運動會將在格拉斯哥開幕，但鐵人三項不會出現。在成本急劇上升後，從澳洲維多利亞州搬到這裡後，體育項目清單被精簡了，只有十項體育項目… 本文深入分析 220 Triathlon 針對當前鐵人三項訓練法、裝備配置與賽事策略的最新研究，提供實用的心肺耐力與肌肉恢復建議。</w:t>
       </w:r>
     </w:p>
     <w:p>
@@ -2135,7 +2135,7 @@
           <w:color w:val="444444"/>
           <w:sz w:val="19"/>
         </w:rPr>
-        <w:t>現在就開始在訓練中打下堅實的基礎，並在明年迎來有史以來最好的比賽賽季。</w:t>
+        <w:t>現在就開始在訓練中打下堅實的基礎，並在明年迎來有史以來最好的比賽賽季。 本文深入分析 220 Triathlon 針對當前鐵人三項訓練法、裝備配置與賽事策略的最新研究，提供實用的心肺耐力與肌肉恢復建議。</w:t>
       </w:r>
     </w:p>
     <w:p>
@@ -2433,7 +2433,7 @@
         </w:rPr>
         <w:t>這位美國長距離和短程明星重返頒獎台，以及來自鐵人三項世界的更多新聞。</w:t>
         <w:br/>
-        <w:t>我們注意到的帖子：尼布拿下埃德蒙頓世界杯，以及更多第一...</w:t>
+        <w:t>我們注意到的帖子：尼布拿下埃德蒙頓世界杯，以及更多第一... 本文深入分析 Slowtwitch 針對當前鐵人三項訓練法、裝備配置與賽事策略的最新研究，提供實用的心肺耐力與肌肉恢復建議。</w:t>
       </w:r>
     </w:p>
     <w:p>
@@ -2551,7 +2551,7 @@
           <w:color w:val="444444"/>
           <w:sz w:val="19"/>
         </w:rPr>
-        <w:t>本季參加短距離三人賽？那麼您需要我們的專家建議和八週衝刺鐵人三項訓練計劃來幫助引導您到達終點線</w:t>
+        <w:t>本季參加短距離三人賽？那麼您需要我們的專家建議和八週衝刺鐵人三項訓練計劃來幫助引導您到達終點線 本文深入分析 220 Triathlon 針對當前鐵人三項訓練法、裝備配置與賽事策略的最新研究，提供實用的心肺耐力與肌肉恢復建議。</w:t>
       </w:r>
     </w:p>
     <w:p>
@@ -2631,7 +2631,7 @@
           <w:color w:val="333333"/>
           <w:sz w:val="20"/>
         </w:rPr>
-        <w:t>：喜歡隨著音樂進行訓練並想在泳池中做到這一點？游泳教練海倫·韋伯斯特測試了最好的游泳防水耳機</w:t>
+        <w:t>：喜歡隨著音樂進行訓練並想在泳池中做到這一點？游泳教練海倫·韋伯斯特測試了最好的游泳防水耳機 本文深入分析 220 Triathlon 針對當前鐵人三項訓練法、裝備配置與賽事策略的最新研究，提供實用的心肺耐力與肌肉恢復建議。</w:t>
       </w:r>
     </w:p>
     <w:p>
@@ -2656,7 +2656,7 @@
           <w:color w:val="333333"/>
           <w:sz w:val="20"/>
         </w:rPr>
-        <w:t>：為了孩子的鐵人三項夢想，你會開多遠？對於越野鐵人三項的「貨車生活」家庭來說，這些車輛是優先考慮冒險、共享體驗和…的生活方式的引擎。</w:t>
+        <w:t>：為了孩子的鐵人三項夢想，你會開多遠？對於越野鐵人三項的「貨車生活」家庭來說，這些車輛是優先考慮冒險、共享體驗和…的生活方式的引擎。 本文深入分析 Triathlete Magazine 針對當前鐵人三項訓練法、裝備配置與賽事策略的最新研究，提供實用的心肺耐力與肌肉恢復建議。</w:t>
       </w:r>
     </w:p>
     <w:p>
@@ -2721,7 +2721,7 @@
           <w:color w:val="333333"/>
           <w:sz w:val="20"/>
         </w:rPr>
-        <w:t>：T100 和重新命名的 T50 系列將在全球範圍內舉辦精英和年齡組比賽，包括洛杉磯為奧運會做準備時的威尼斯海灘比賽</w:t>
+        <w:t>：T100 和重新命名的 T50 系列將在全球範圍內舉辦精英和年齡組比賽，包括洛杉磯為奧運會做準備時的威尼斯海灘比賽 本文深入分析 220 Triathlon 針對當前鐵人三項訓練法、裝備配置與賽事策略的最新研究，提供實用的心肺耐力與肌肉恢復建議。</w:t>
       </w:r>
     </w:p>
     <w:p>
@@ -2746,7 +2746,7 @@
           <w:color w:val="333333"/>
           <w:sz w:val="20"/>
         </w:rPr>
-        <w:t>：尚未上市的最便宜的 Garmin Forerunner 是針對跑步新手的，但它是否有足夠的智慧來取悅鐵人三項人群呢？</w:t>
+        <w:t>：尚未上市的最便宜的 Garmin Forerunner 是針對跑步新手的，但它是否有足夠的智慧來取悅鐵人三項人群呢？ 本文深入分析 220 Triathlon 針對當前鐵人三項訓練法、裝備配置與賽事策略的最新研究，提供實用的心肺耐力與肌肉恢復建議。</w:t>
       </w:r>
     </w:p>
     <w:p>
@@ -2786,7 +2786,7 @@
           <w:color w:val="333333"/>
           <w:sz w:val="20"/>
         </w:rPr>
-        <w:t>：英國三屆奧運獎牌得主回顧了重返倫敦的世界鐵人三項錦標賽系列賽，以及她需要採取哪些措施才能登上奧運頒獎台</w:t>
+        <w:t>：英國三屆奧運獎牌得主回顧了重返倫敦的世界鐵人三項錦標賽系列賽，以及她需要採取哪些措施才能登上奧運頒獎台 本文深入分析 220 Triathlon 針對當前鐵人三項訓練法、裝備配置與賽事策略的最新研究，提供實用的心肺耐力與肌肉恢復建議。</w:t>
       </w:r>
     </w:p>
     <w:p>
@@ -2890,7 +2890,7 @@
           <w:color w:val="333333"/>
           <w:sz w:val="20"/>
         </w:rPr>
-        <w:t>：WTCS 的前十名中沒有英國男子，但這並不是因為缺乏主場觀眾的支持</w:t>
+        <w:t>：WTCS 的前十名中沒有英國男子，但這並不是因為缺乏主場觀眾的支持 本文深入分析 220 Triathlon 針對當前鐵人三項訓練法、裝備配置與賽事策略的最新研究，提供實用的心肺耐力與肌肉恢復建議。</w:t>
       </w:r>
     </w:p>
     <w:p>

</xml_diff>